<commit_message>
Refactored: getNumItems (shorter, more efficient) Updated: documentation
</commit_message>
<xml_diff>
--- a/docs/ShowItAll.docx
+++ b/docs/ShowItAll.docx
@@ -55,7 +55,7 @@
         <w:rPr>
           <w:sz w:val="38"/>
         </w:rPr>
-        <w:t>8</w:t>
+        <w:t>9</w:t>
       </w:r>
     </w:p>
     <w:p>
@@ -90,25 +90,19 @@
         <w:t xml:space="preserve"> with colour </w:t>
       </w:r>
       <w:r>
-        <w:t>LCDs</w:t>
-      </w:r>
-      <w:r>
-        <w:t xml:space="preserve"> (X10/X12S, Jumper T16, RM TX16S etc.)</w:t>
+        <w:t>screens</w:t>
       </w:r>
       <w:r>
         <w:br/>
       </w:r>
       <w:r>
-        <w:br/>
-      </w:r>
-      <w:r>
         <w:rPr>
           <w:noProof/>
         </w:rPr>
         <w:drawing>
-          <wp:inline distT="0" distB="0" distL="0" distR="0" wp14:anchorId="5644BBDE" wp14:editId="36D998FF">
-            <wp:extent cx="4362450" cy="2058787"/>
-            <wp:effectExtent l="0" t="0" r="0" b="0"/>
+          <wp:inline distT="0" distB="0" distL="0" distR="0" wp14:anchorId="5644BBDE" wp14:editId="0D43235C">
+            <wp:extent cx="3461131" cy="1965402"/>
+            <wp:effectExtent l="95250" t="95250" r="101600" b="92075"/>
             <wp:docPr id="1" name="Picture 1"/>
             <wp:cNvGraphicFramePr>
               <a:graphicFrameLocks xmlns:a="http://schemas.openxmlformats.org/drawingml/2006/main" noChangeAspect="1"/>
@@ -137,7 +131,7 @@
                   <pic:spPr bwMode="auto">
                     <a:xfrm>
                       <a:off x="0" y="0"/>
-                      <a:ext cx="4371473" cy="2063045"/>
+                      <a:ext cx="3461131" cy="1965402"/>
                     </a:xfrm>
                     <a:prstGeom prst="rect">
                       <a:avLst/>
@@ -146,6 +140,13 @@
                     <a:ln>
                       <a:noFill/>
                     </a:ln>
+                    <a:effectLst>
+                      <a:outerShdw blurRad="63500" sx="102000" sy="102000" algn="ctr" rotWithShape="0">
+                        <a:prstClr val="black">
+                          <a:alpha val="40000"/>
+                        </a:prstClr>
+                      </a:outerShdw>
+                    </a:effectLst>
                   </pic:spPr>
                 </pic:pic>
               </a:graphicData>
@@ -164,13 +165,16 @@
     </w:p>
     <w:p>
       <w:r>
-        <w:t>Displays basic info</w:t>
-      </w:r>
-      <w:r>
-        <w:t xml:space="preserve"> about the setup</w:t>
-      </w:r>
-      <w:r>
-        <w:t>:</w:t>
+        <w:t xml:space="preserve">Displays </w:t>
+      </w:r>
+      <w:r>
+        <w:t xml:space="preserve">essential </w:t>
+      </w:r>
+      <w:r>
+        <w:t>info</w:t>
+      </w:r>
+      <w:r>
+        <w:t xml:space="preserve"> about the currently selected model:</w:t>
       </w:r>
       <w:r>
         <w:t xml:space="preserve"> </w:t>
@@ -475,7 +479,13 @@
         <w:pStyle w:val="Heading2"/>
       </w:pPr>
       <w:r>
-        <w:t>Min r</w:t>
+        <w:t>Min</w:t>
+      </w:r>
+      <w:r>
+        <w:t>imum</w:t>
+      </w:r>
+      <w:r>
+        <w:t xml:space="preserve"> r</w:t>
       </w:r>
       <w:r>
         <w:t>equirements</w:t>
@@ -493,10 +503,13 @@
         <w:t>T</w:t>
       </w:r>
       <w:r>
-        <w:t xml:space="preserve">ransmitter </w:t>
-      </w:r>
-      <w:r>
-        <w:t>with colour screen</w:t>
+        <w:t>ransmitter</w:t>
+      </w:r>
+      <w:r>
+        <w:t xml:space="preserve"> with colour panels of width </w:t>
+      </w:r>
+      <w:r>
+        <w:t>480 or 800 px</w:t>
       </w:r>
     </w:p>
     <w:p>
@@ -528,6 +541,20 @@
     </w:p>
     <w:p>
       <w:pPr>
+        <w:ind w:left="360"/>
+      </w:pPr>
+      <w:r>
+        <w:t>If the panel does not meet the</w:t>
+      </w:r>
+      <w:r>
+        <w:t xml:space="preserve"> requirements</w:t>
+      </w:r>
+      <w:r>
+        <w:t>, an error message is displayed.</w:t>
+      </w:r>
+    </w:p>
+    <w:p>
+      <w:pPr>
         <w:pStyle w:val="Heading2"/>
       </w:pPr>
       <w:r>
@@ -612,19 +639,22 @@
         </w:numPr>
       </w:pPr>
       <w:r>
-        <w:t xml:space="preserve">Select the </w:t>
-      </w:r>
-      <w:r>
-        <w:t xml:space="preserve">screen </w:t>
-      </w:r>
-      <w:r>
-        <w:t>layout</w:t>
-      </w:r>
-      <w:r>
-        <w:t xml:space="preserve"> (full screen recommended)</w:t>
-      </w:r>
-      <w:r>
-        <w:t>, then configure the widget</w:t>
+        <w:t>Choose a full screen layout</w:t>
+      </w:r>
+    </w:p>
+    <w:p>
+      <w:pPr>
+        <w:pStyle w:val="ListParagraph"/>
+        <w:numPr>
+          <w:ilvl w:val="0"/>
+          <w:numId w:val="4"/>
+        </w:numPr>
+      </w:pPr>
+      <w:r>
+        <w:t>C</w:t>
+      </w:r>
+      <w:r>
+        <w:t>onfigure the widget</w:t>
       </w:r>
       <w:r>
         <w:t xml:space="preserve"> as required</w:t>
@@ -641,6 +671,7 @@
         <w:pStyle w:val="Heading2"/>
       </w:pPr>
       <w:r>
+        <w:lastRenderedPageBreak/>
         <w:t>Upgrading</w:t>
       </w:r>
       <w:r>
@@ -662,13 +693,10 @@
         <w:t>To upgrade from a previous version</w:t>
       </w:r>
       <w:r>
-        <w:t xml:space="preserve">, </w:t>
-      </w:r>
-      <w:r>
-        <w:t xml:space="preserve">simply </w:t>
-      </w:r>
-      <w:r>
-        <w:t>replace</w:t>
+        <w:t>, replace</w:t>
+      </w:r>
+      <w:r>
+        <w:t xml:space="preserve"> the existing</w:t>
       </w:r>
       <w:r>
         <w:t xml:space="preserve"> </w:t>
@@ -677,19 +705,7 @@
         <w:t>main.lua</w:t>
       </w:r>
       <w:r>
-        <w:t xml:space="preserve"> </w:t>
-      </w:r>
-      <w:r>
-        <w:t xml:space="preserve">on the SD card </w:t>
-      </w:r>
-      <w:r>
-        <w:t xml:space="preserve">with the </w:t>
-      </w:r>
-      <w:r>
-        <w:t>latest</w:t>
-      </w:r>
-      <w:r>
-        <w:t xml:space="preserve"> version.</w:t>
+        <w:t>.</w:t>
       </w:r>
     </w:p>
     <w:p>
@@ -697,7 +713,6 @@
         <w:pStyle w:val="Heading2"/>
       </w:pPr>
       <w:r>
-        <w:lastRenderedPageBreak/>
         <w:t xml:space="preserve">Widget </w:t>
       </w:r>
       <w:r>
@@ -1155,40 +1170,10 @@
     </w:p>
     <w:p>
       <w:r>
-        <w:t xml:space="preserve">This script </w:t>
-      </w:r>
-      <w:r>
-        <w:t xml:space="preserve">has been </w:t>
-      </w:r>
-      <w:r>
-        <w:t xml:space="preserve">successfully </w:t>
-      </w:r>
-      <w:r>
-        <w:t xml:space="preserve">tested </w:t>
-      </w:r>
-      <w:r>
-        <w:t xml:space="preserve">on the author’s </w:t>
-      </w:r>
-      <w:r>
-        <w:t xml:space="preserve">TX16S </w:t>
-      </w:r>
-      <w:r>
-        <w:t>under OpenTX and EdgeTX</w:t>
-      </w:r>
-      <w:r>
-        <w:t xml:space="preserve">. </w:t>
-      </w:r>
-      <w:r>
-        <w:t>H</w:t>
-      </w:r>
-      <w:r>
-        <w:t>owever</w:t>
-      </w:r>
-      <w:r>
-        <w:t xml:space="preserve"> </w:t>
-      </w:r>
-      <w:r>
-        <w:t>given the limitless combinations of operating system versions,</w:t>
+        <w:t>The script has been extensively tested, however g</w:t>
+      </w:r>
+      <w:r>
+        <w:t>iven the limitless combinations of operating system versions,</w:t>
       </w:r>
       <w:r>
         <w:t xml:space="preserve"> </w:t>
@@ -1294,34 +1279,19 @@
     <w:p/>
     <w:p>
       <w:r>
-        <w:t>Rev 1.</w:t>
-      </w:r>
-      <w:r>
         <w:t>20</w:t>
       </w:r>
       <w:r>
         <w:t xml:space="preserve"> </w:t>
       </w:r>
       <w:r>
-        <w:tab/>
-      </w:r>
-      <w:r>
-        <w:tab/>
-      </w:r>
-      <w:r>
-        <w:t>2</w:t>
-      </w:r>
-      <w:r>
-        <w:t xml:space="preserve">4 </w:t>
-      </w:r>
-      <w:r>
-        <w:t>July</w:t>
-      </w:r>
-      <w:r>
-        <w:t xml:space="preserve"> 202</w:t>
-      </w:r>
-      <w:r>
-        <w:t>5</w:t>
+        <w:t xml:space="preserve">Feb </w:t>
+      </w:r>
+      <w:r>
+        <w:t>202</w:t>
+      </w:r>
+      <w:r>
+        <w:t>6</w:t>
       </w:r>
     </w:p>
     <w:sectPr>

</xml_diff>